<commit_message>
Add screenshots, fill name/ID, embed images in report and DOCX
</commit_message>
<xml_diff>
--- a/LAB2_Submission.docx
+++ b/LAB2_Submission.docx
@@ -12,7 +12,7 @@
     </w:p>
     <w:p>
       <w:r>
-        <w:t>Student Name: [REPLACE WITH YOUR FULL NAME] Student ID: [REPLACE WITH YOUR STUDENT NUMBER] Course: TECHIN 510 — University of Washington GIX Assignment: Lab 2 — Anatomy of Coding Agents GitHub Repository: https://github.com/GIX-Luyao/lab-2-zhuxirui677</w:t>
+        <w:t>Student Name: Xirui Zhu Student ID: 2530655 Course: TECHIN 510 — University of Washington GIX Assignment: Lab 2 — Anatomy of Coding Agents GitHub Repository: https://github.com/GIX-Luyao/lab-2-zhuxirui677</w:t>
       </w:r>
     </w:p>
     <w:p>
@@ -23,7 +23,7 @@
         <w:rPr>
           <w:i/>
         </w:rPr>
-        <w:t>Replace the two bracketed fields above, then export this repository’s bundled report file LAB2_FULL_REPORT.md to PDF (see reports/PDF_EXPORT_INSTRUCTIONS.md).</w:t>
+        <w:t>Export LAB2_FULL_REPORT.md to PDF via reports/PDF_EXPORT_INSTRUCTIONS.md.</w:t>
       </w:r>
     </w:p>
     <w:p>
@@ -277,7 +277,125 @@
     </w:p>
     <w:p>
       <w:r>
-        <w:t>&lt;!-- !Tip Calculator --&gt; &lt;!-- !Eligibility — Cursor --&gt; &lt;!-- !Eligibility — ChatGPT style --&gt;</w:t>
+        <w:t>Tip Calculator</w:t>
+      </w:r>
+    </w:p>
+    <w:p>
+      <w:r>
+        <w:drawing>
+          <wp:inline xmlns:a="http://schemas.openxmlformats.org/drawingml/2006/main" xmlns:pic="http://schemas.openxmlformats.org/drawingml/2006/picture">
+            <wp:extent cx="5486400" cy="2943348"/>
+            <wp:docPr id="1" name="Picture 1"/>
+            <wp:cNvGraphicFramePr>
+              <a:graphicFrameLocks noChangeAspect="1"/>
+            </wp:cNvGraphicFramePr>
+            <a:graphic>
+              <a:graphicData uri="http://schemas.openxmlformats.org/drawingml/2006/picture">
+                <pic:pic>
+                  <pic:nvPicPr>
+                    <pic:cNvPr id="0" name="tip_calculator_running.png"/>
+                    <pic:cNvPicPr/>
+                  </pic:nvPicPr>
+                  <pic:blipFill>
+                    <a:blip r:embed="rId9"/>
+                    <a:stretch>
+                      <a:fillRect/>
+                    </a:stretch>
+                  </pic:blipFill>
+                  <pic:spPr>
+                    <a:xfrm>
+                      <a:off x="0" y="0"/>
+                      <a:ext cx="5486400" cy="2943348"/>
+                    </a:xfrm>
+                    <a:prstGeom prst="rect"/>
+                  </pic:spPr>
+                </pic:pic>
+              </a:graphicData>
+            </a:graphic>
+          </wp:inline>
+        </w:drawing>
+      </w:r>
+    </w:p>
+    <w:p>
+      <w:r>
+        <w:t>Eligibility — Cursor</w:t>
+      </w:r>
+    </w:p>
+    <w:p>
+      <w:r>
+        <w:drawing>
+          <wp:inline xmlns:a="http://schemas.openxmlformats.org/drawingml/2006/main" xmlns:pic="http://schemas.openxmlformats.org/drawingml/2006/picture">
+            <wp:extent cx="5486400" cy="3884489"/>
+            <wp:docPr id="2" name="Picture 2"/>
+            <wp:cNvGraphicFramePr>
+              <a:graphicFrameLocks noChangeAspect="1"/>
+            </wp:cNvGraphicFramePr>
+            <a:graphic>
+              <a:graphicData uri="http://schemas.openxmlformats.org/drawingml/2006/picture">
+                <pic:pic>
+                  <pic:nvPicPr>
+                    <pic:cNvPr id="0" name="eligibility_cursor_running.png"/>
+                    <pic:cNvPicPr/>
+                  </pic:nvPicPr>
+                  <pic:blipFill>
+                    <a:blip r:embed="rId10"/>
+                    <a:stretch>
+                      <a:fillRect/>
+                    </a:stretch>
+                  </pic:blipFill>
+                  <pic:spPr>
+                    <a:xfrm>
+                      <a:off x="0" y="0"/>
+                      <a:ext cx="5486400" cy="3884489"/>
+                    </a:xfrm>
+                    <a:prstGeom prst="rect"/>
+                  </pic:spPr>
+                </pic:pic>
+              </a:graphicData>
+            </a:graphic>
+          </wp:inline>
+        </w:drawing>
+      </w:r>
+    </w:p>
+    <w:p>
+      <w:r>
+        <w:t>Eligibility — ChatGPT style</w:t>
+      </w:r>
+    </w:p>
+    <w:p>
+      <w:r>
+        <w:drawing>
+          <wp:inline xmlns:a="http://schemas.openxmlformats.org/drawingml/2006/main" xmlns:pic="http://schemas.openxmlformats.org/drawingml/2006/picture">
+            <wp:extent cx="5486400" cy="3426425"/>
+            <wp:docPr id="3" name="Picture 3"/>
+            <wp:cNvGraphicFramePr>
+              <a:graphicFrameLocks noChangeAspect="1"/>
+            </wp:cNvGraphicFramePr>
+            <a:graphic>
+              <a:graphicData uri="http://schemas.openxmlformats.org/drawingml/2006/picture">
+                <pic:pic>
+                  <pic:nvPicPr>
+                    <pic:cNvPr id="0" name="eligibility_chatgpt_running.png"/>
+                    <pic:cNvPicPr/>
+                  </pic:nvPicPr>
+                  <pic:blipFill>
+                    <a:blip r:embed="rId11"/>
+                    <a:stretch>
+                      <a:fillRect/>
+                    </a:stretch>
+                  </pic:blipFill>
+                  <pic:spPr>
+                    <a:xfrm>
+                      <a:off x="0" y="0"/>
+                      <a:ext cx="5486400" cy="3426425"/>
+                    </a:xfrm>
+                    <a:prstGeom prst="rect"/>
+                  </pic:spPr>
+                </pic:pic>
+              </a:graphicData>
+            </a:graphic>
+          </wp:inline>
+        </w:drawing>
       </w:r>
     </w:p>
     <w:p>
@@ -3322,7 +3440,43 @@
     </w:p>
     <w:p>
       <w:r>
-        <w:t>[Figure omitted — file not found: docs/screenshots/tip_calculator_running.png]</w:t>
+        <w:t>Tip Calculator running</w:t>
+      </w:r>
+    </w:p>
+    <w:p>
+      <w:r>
+        <w:drawing>
+          <wp:inline xmlns:a="http://schemas.openxmlformats.org/drawingml/2006/main" xmlns:pic="http://schemas.openxmlformats.org/drawingml/2006/picture">
+            <wp:extent cx="5486400" cy="2943348"/>
+            <wp:docPr id="4" name="Picture 4"/>
+            <wp:cNvGraphicFramePr>
+              <a:graphicFrameLocks noChangeAspect="1"/>
+            </wp:cNvGraphicFramePr>
+            <a:graphic>
+              <a:graphicData uri="http://schemas.openxmlformats.org/drawingml/2006/picture">
+                <pic:pic>
+                  <pic:nvPicPr>
+                    <pic:cNvPr id="0" name="tip_calculator_running.png"/>
+                    <pic:cNvPicPr/>
+                  </pic:nvPicPr>
+                  <pic:blipFill>
+                    <a:blip r:embed="rId9"/>
+                    <a:stretch>
+                      <a:fillRect/>
+                    </a:stretch>
+                  </pic:blipFill>
+                  <pic:spPr>
+                    <a:xfrm>
+                      <a:off x="0" y="0"/>
+                      <a:ext cx="5486400" cy="2943348"/>
+                    </a:xfrm>
+                    <a:prstGeom prst="rect"/>
+                  </pic:spPr>
+                </pic:pic>
+              </a:graphicData>
+            </a:graphic>
+          </wp:inline>
+        </w:drawing>
       </w:r>
     </w:p>
     <w:p>

</xml_diff>